<commit_message>
Prepare for publication: forward-slash script paths in reproducibility block; unify RL99 (18.02/13.14) and bootstrap ARI (0.684) across README and English manuscript
</commit_message>
<xml_diff>
--- a/article/gdc_bioinformatics_ms.docx
+++ b/article/gdc_bioinformatics_ms.docx
@@ -43,7 +43,7 @@
         <w:t>Results.</w:t>
       </w:r>
       <w:r>
-        <w:t xml:space="preserve"> All 601 samples belong to TCGA-LUAD: 542 tumours and 59 normal tissues from 518 patients (58 matched pairs). On the real biological groups the normalized topological divergence is d̄_topo = 0.600 (p &lt; 0.005), 22-fold larger than on the PC1 split (0.027), showing that topology responds primarily to a change of the whole distribution; the signal persists (d̄_topo = 0.417) when genes are sampled at random rather than by variance. Both groups show spectra far beyond the Marchenko–Pastur bound (λ_max/λ₊ = 22.7 and 5.6); the top eigenvector is an immunoglobulin (plasma-cell) module in both. A significant nonlinear SFTPC×BPIFA1 dependence reported previously on the pooled sample disappears within groups (p = 0.09, 0.48): it was a mixture artifact. Maxima-of-expression tails are Fréchet in both groups; RL99 is higher in tumours (18.0 vs 13.1, permutation p = 0.005). A matched Bayesian model yields a tissue effect of −5.62 (94% HDI [−6.21, −4.95], R̂ = 1.002, zero divergences). Plate batch effects concentrate in PC3–PC5 (R² up to 0.36). The PC1 split agreed with tissue status only 40% (all normals in PC1+); the dominant transcriptomic axis is an intratumoural gradient, not tumour/normal. As a benchmark, DESeq2 identified 27,254 differentially expressed genes; the overlap between high-variance genes and DE genes is only 6% (Jaccard 0.06), and log2FC correlates with PC1 loadings at r = 0.12.</w:t>
+        <w:t xml:space="preserve"> All 601 samples belong to TCGA-LUAD: 542 tumours and 59 normal tissues from 518 patients (58 matched pairs). On the real biological groups the normalized topological divergence is d̄_topo = 0.600 (p &lt; 0.005), 22-fold larger than on the PC1 split (0.027), showing that topology responds primarily to a change of the whole distribution; the signal persists (d̄_topo = 0.417) when genes are sampled at random rather than by variance. Both groups show spectra far beyond the Marchenko–Pastur bound (λ_max/λ₊ = 22.7 and 5.6); the top eigenvector is an immunoglobulin (plasma-cell) module in both. A significant nonlinear SFTPC×BPIFA1 dependence reported previously on the pooled sample disappears within groups (p = 0.09, 0.48): it was a mixture artifact. Maxima-of-expression tails are Fréchet in both groups; RL99 is higher in tumours (18.02 vs 13.14, permutation p = 0.005). A matched Bayesian model yields a tissue effect of −5.62 (94% HDI [−6.21, −4.95], R̂ = 1.002, zero divergences). Plate batch effects concentrate in PC3–PC5 (R² up to 0.36). The PC1 split agreed with tissue status only 40% (all normals in PC1+); the dominant transcriptomic axis is an intratumoural gradient, not tumour/normal. As a benchmark, DESeq2 identified 27,254 differentially expressed genes; the overlap between high-variance genes and DE genes is only 6% (Jaccard 0.06), and log2FC correlates with PC1 loadings at r = 0.12.</w:t>
       </w:r>
     </w:p>
     <w:p>
@@ -706,7 +706,7 @@
       <w:r>
         <w:drawing>
           <wp:inline xmlns:a="http://schemas.openxmlformats.org/drawingml/2006/main" xmlns:pic="http://schemas.openxmlformats.org/drawingml/2006/picture">
-            <wp:extent cx="5486400" cy="3657600"/>
+            <wp:extent cx="5486400" cy="3798277"/>
             <wp:docPr id="2" name="Picture 2"/>
             <wp:cNvGraphicFramePr>
               <a:graphicFrameLocks noChangeAspect="1"/>
@@ -727,7 +727,7 @@
                   <pic:spPr>
                     <a:xfrm>
                       <a:off x="0" y="0"/>
-                      <a:ext cx="5486400" cy="3657600"/>
+                      <a:ext cx="5486400" cy="3798277"/>
                     </a:xfrm>
                     <a:prstGeom prst="rect"/>
                   </pic:spPr>
@@ -794,7 +794,7 @@
       <w:r>
         <w:drawing>
           <wp:inline xmlns:a="http://schemas.openxmlformats.org/drawingml/2006/main" xmlns:pic="http://schemas.openxmlformats.org/drawingml/2006/picture">
-            <wp:extent cx="5486400" cy="4488873"/>
+            <wp:extent cx="5486400" cy="3798277"/>
             <wp:docPr id="4" name="Picture 4"/>
             <wp:cNvGraphicFramePr>
               <a:graphicFrameLocks noChangeAspect="1"/>
@@ -815,7 +815,7 @@
                   <pic:spPr>
                     <a:xfrm>
                       <a:off x="0" y="0"/>
-                      <a:ext cx="5486400" cy="4488873"/>
+                      <a:ext cx="5486400" cy="3798277"/>
                     </a:xfrm>
                     <a:prstGeom prst="rect"/>
                   </pic:spPr>
@@ -838,7 +838,7 @@
       <w:r>
         <w:drawing>
           <wp:inline xmlns:a="http://schemas.openxmlformats.org/drawingml/2006/main" xmlns:pic="http://schemas.openxmlformats.org/drawingml/2006/picture">
-            <wp:extent cx="5486400" cy="3657600"/>
+            <wp:extent cx="5486400" cy="3798277"/>
             <wp:docPr id="5" name="Picture 5"/>
             <wp:cNvGraphicFramePr>
               <a:graphicFrameLocks noChangeAspect="1"/>
@@ -859,7 +859,7 @@
                   <pic:spPr>
                     <a:xfrm>
                       <a:off x="0" y="0"/>
-                      <a:ext cx="5486400" cy="3657600"/>
+                      <a:ext cx="5486400" cy="3798277"/>
                     </a:xfrm>
                     <a:prstGeom prst="rect"/>
                   </pic:spPr>

</xml_diff>